<commit_message>
Python Notes and Book is Added to this Main Python Directory
</commit_message>
<xml_diff>
--- a/Installation, VS Code, ‎Extensions, GUI & Best Practices .docx
+++ b/Installation, VS Code, ‎Extensions, GUI & Best Practices .docx
@@ -97,22 +97,8 @@
           <w:bCs/>
           <w:highlight w:val="yellow"/>
         </w:rPr>
-        <w:t>.</w:t>
-      </w:r>
-      <w:proofErr w:type="spellStart"/>
-      <w:proofErr w:type="gramStart"/>
-      <w:r>
-        <w:rPr>
-          <w:rStyle w:val="HTMLCode"/>
-          <w:rFonts w:eastAsiaTheme="majorEastAsia"/>
-          <w:b/>
-          <w:bCs/>
-          <w:highlight w:val="yellow"/>
-        </w:rPr>
-        <w:t>tar.xz</w:t>
-      </w:r>
-      <w:proofErr w:type="spellEnd"/>
-      <w:proofErr w:type="gramEnd"/>
+        <w:t>.tar.xz</w:t>
+      </w:r>
       <w:r>
         <w:rPr>
           <w:b/>
@@ -153,35 +139,16 @@
           <w:b/>
           <w:bCs/>
         </w:rPr>
-        <w:t xml:space="preserve">Source </w:t>
-      </w:r>
-      <w:proofErr w:type="gramStart"/>
-      <w:r>
-        <w:rPr>
-          <w:b/>
-          <w:bCs/>
-        </w:rPr>
-        <w:t>Code (</w:t>
-      </w:r>
-      <w:r>
-        <w:rPr>
-          <w:rStyle w:val="HTMLCode"/>
-          <w:b/>
-          <w:bCs/>
-        </w:rPr>
-        <w:t>.</w:t>
-      </w:r>
-      <w:proofErr w:type="spellStart"/>
-      <w:r>
-        <w:rPr>
-          <w:rStyle w:val="HTMLCode"/>
-          <w:b/>
-          <w:bCs/>
-        </w:rPr>
-        <w:t>tar.xz</w:t>
-      </w:r>
-      <w:proofErr w:type="spellEnd"/>
-      <w:proofErr w:type="gramEnd"/>
+        <w:t>Source Code (</w:t>
+      </w:r>
+      <w:r>
+        <w:rPr>
+          <w:rStyle w:val="HTMLCode"/>
+          <w:b/>
+          <w:bCs/>
+        </w:rPr>
+        <w:t>.tar.xz</w:t>
+      </w:r>
       <w:r>
         <w:rPr>
           <w:b/>
@@ -292,32 +259,15 @@
           <w:b/>
           <w:bCs/>
         </w:rPr>
-        <w:t xml:space="preserve">Python Install Manager / Standard </w:t>
-      </w:r>
-      <w:proofErr w:type="gramStart"/>
-      <w:r>
-        <w:rPr>
-          <w:b/>
-          <w:bCs/>
-        </w:rPr>
-        <w:t>Installer (</w:t>
-      </w:r>
-      <w:r>
-        <w:rPr>
-          <w:rStyle w:val="HTMLCode"/>
-          <w:b/>
-          <w:bCs/>
-        </w:rPr>
-        <w:t>.</w:t>
-      </w:r>
-      <w:proofErr w:type="gramEnd"/>
-      <w:r>
-        <w:rPr>
-          <w:rStyle w:val="HTMLCode"/>
-          <w:b/>
-          <w:bCs/>
-        </w:rPr>
-        <w:t>exe</w:t>
+        <w:t>Python Install Manager / Standard Installer (</w:t>
+      </w:r>
+      <w:r>
+        <w:rPr>
+          <w:rStyle w:val="HTMLCode"/>
+          <w:b/>
+          <w:bCs/>
+        </w:rPr>
+        <w:t>.exe</w:t>
       </w:r>
       <w:r>
         <w:rPr>
@@ -426,15 +376,7 @@
         <w:t>python.org</w:t>
       </w:r>
       <w:r>
-        <w:t xml:space="preserve"> </w:t>
-      </w:r>
-      <w:proofErr w:type="spellStart"/>
-      <w:r>
-        <w:t>kholein</w:t>
-      </w:r>
-      <w:proofErr w:type="spellEnd"/>
-      <w:r>
-        <w:t>.</w:t>
+        <w:t xml:space="preserve"> kholein.</w:t>
       </w:r>
     </w:p>
     <w:p>
@@ -635,35 +577,7 @@
         <w:rPr>
           <w:rStyle w:val="HTMLCode"/>
         </w:rPr>
-        <w:t xml:space="preserve">Install the current latest version of </w:t>
-      </w:r>
-      <w:proofErr w:type="spellStart"/>
-      <w:r>
-        <w:rPr>
-          <w:rStyle w:val="HTMLCode"/>
-        </w:rPr>
-        <w:t>CPython</w:t>
-      </w:r>
-      <w:proofErr w:type="spellEnd"/>
-      <w:r>
-        <w:rPr>
-          <w:rStyle w:val="HTMLCode"/>
-        </w:rPr>
-        <w:t xml:space="preserve">? Install </w:t>
-      </w:r>
-      <w:proofErr w:type="spellStart"/>
-      <w:r>
-        <w:rPr>
-          <w:rStyle w:val="HTMLCode"/>
-        </w:rPr>
-        <w:t>CPython</w:t>
-      </w:r>
-      <w:proofErr w:type="spellEnd"/>
-      <w:r>
-        <w:rPr>
-          <w:rStyle w:val="HTMLCode"/>
-        </w:rPr>
-        <w:t xml:space="preserve"> now? [Y/n]</w:t>
+        <w:t>Install the current latest version of CPython? Install CPython now? [Y/n]</w:t>
       </w:r>
     </w:p>
     <w:p>
@@ -729,15 +643,7 @@
         <w:t>py-manager</w:t>
       </w:r>
       <w:r>
-        <w:t xml:space="preserve"> sirf installer tool hai. Yeh step actual </w:t>
-      </w:r>
-      <w:proofErr w:type="spellStart"/>
-      <w:r>
-        <w:t>CPython</w:t>
-      </w:r>
-      <w:proofErr w:type="spellEnd"/>
-      <w:r>
-        <w:t xml:space="preserve"> Engine/Runtime download aur extract karta hai.</w:t>
+        <w:t xml:space="preserve"> sirf installer tool hai. Yeh step actual CPython Engine/Runtime download aur extract karta hai.</w:t>
       </w:r>
     </w:p>
     <w:p>
@@ -831,24 +737,14 @@
       <w:r>
         <w:t>Command Prompt (</w:t>
       </w:r>
-      <w:proofErr w:type="spellStart"/>
       <w:r>
         <w:rPr>
           <w:rStyle w:val="HTMLCode"/>
         </w:rPr>
         <w:t>cmd</w:t>
       </w:r>
-      <w:proofErr w:type="spellEnd"/>
-      <w:r>
-        <w:t xml:space="preserve">) </w:t>
-      </w:r>
-      <w:proofErr w:type="spellStart"/>
-      <w:r>
-        <w:t>kholein</w:t>
-      </w:r>
-      <w:proofErr w:type="spellEnd"/>
-      <w:r>
-        <w:t xml:space="preserve"> aur yeh commands test karein:</w:t>
+      <w:r>
+        <w:t>) kholein aur yeh commands test karein:</w:t>
       </w:r>
     </w:p>
     <w:p>
@@ -1018,19 +914,11 @@
       <w:r>
         <w:t xml:space="preserve">Yahan direct Python line run kar sakte hain: </w:t>
       </w:r>
-      <w:proofErr w:type="gramStart"/>
-      <w:r>
-        <w:rPr>
-          <w:rStyle w:val="HTMLCode"/>
-        </w:rPr>
-        <w:t>print(</w:t>
-      </w:r>
-      <w:proofErr w:type="gramEnd"/>
-      <w:r>
-        <w:rPr>
-          <w:rStyle w:val="HTMLCode"/>
-        </w:rPr>
-        <w:t>"Testing Terminal")</w:t>
+      <w:r>
+        <w:rPr>
+          <w:rStyle w:val="HTMLCode"/>
+        </w:rPr>
+        <w:t>print("Testing Terminal")</w:t>
       </w:r>
     </w:p>
     <w:p>
@@ -1044,19 +932,11 @@
       <w:r>
         <w:t xml:space="preserve">Shell se bahar aane ke liye type karein: </w:t>
       </w:r>
-      <w:proofErr w:type="gramStart"/>
-      <w:r>
-        <w:rPr>
-          <w:rStyle w:val="HTMLCode"/>
-        </w:rPr>
-        <w:t>exit(</w:t>
-      </w:r>
-      <w:proofErr w:type="gramEnd"/>
-      <w:r>
-        <w:rPr>
-          <w:rStyle w:val="HTMLCode"/>
-        </w:rPr>
-        <w:t>)</w:t>
+      <w:r>
+        <w:rPr>
+          <w:rStyle w:val="HTMLCode"/>
+        </w:rPr>
+        <w:t>exit()</w:t>
       </w:r>
       <w:r>
         <w:rPr>
@@ -1137,23 +1017,7 @@
         <w:t>Kyun Use Hoti Hai?</w:t>
       </w:r>
       <w:r>
-        <w:t xml:space="preserve"> Code auto-completion (IntelliSense), syntax highlighting, linting (errors </w:t>
-      </w:r>
-      <w:proofErr w:type="spellStart"/>
-      <w:r>
-        <w:t>pakadna</w:t>
-      </w:r>
-      <w:proofErr w:type="spellEnd"/>
-      <w:r>
-        <w:t xml:space="preserve">), debugging support, aur Python interpreter </w:t>
-      </w:r>
-      <w:proofErr w:type="gramStart"/>
-      <w:r>
-        <w:t>select</w:t>
-      </w:r>
-      <w:proofErr w:type="gramEnd"/>
-      <w:r>
-        <w:t xml:space="preserve"> karne ke liye.</w:t>
+        <w:t xml:space="preserve"> Code auto-completion (IntelliSense), syntax highlighting, linting (errors pakadna), debugging support, aur Python interpreter select karne ke liye.</w:t>
       </w:r>
     </w:p>
     <w:p>
@@ -1244,15 +1108,7 @@
         </w:numPr>
       </w:pPr>
       <w:r>
-        <w:t xml:space="preserve">Microsoft </w:t>
-      </w:r>
-      <w:proofErr w:type="spellStart"/>
-      <w:r>
-        <w:t>walli</w:t>
-      </w:r>
-      <w:proofErr w:type="spellEnd"/>
-      <w:r>
-        <w:t xml:space="preserve"> official extension par </w:t>
+        <w:t xml:space="preserve">Microsoft walli official extension par </w:t>
       </w:r>
       <w:r>
         <w:rPr>
@@ -1406,19 +1262,14 @@
       <w:r>
         <w:rPr>
           <w:rStyle w:val="HTMLCode"/>
+          <w:b/>
+          <w:bCs/>
+          <w:color w:val="EE0000"/>
         </w:rPr>
         <w:t>Ctrl + Alt + N</w:t>
       </w:r>
       <w:r>
-        <w:t xml:space="preserve">) se code </w:t>
-      </w:r>
-      <w:proofErr w:type="gramStart"/>
-      <w:r>
-        <w:t>execute</w:t>
-      </w:r>
-      <w:proofErr w:type="gramEnd"/>
-      <w:r>
-        <w:t xml:space="preserve"> karne ke liye.</w:t>
+        <w:t>) se code execute karne ke liye.</w:t>
       </w:r>
     </w:p>
     <w:p>
@@ -1528,26 +1379,10 @@
         <w:rPr>
           <w:rStyle w:val="HTMLCode"/>
         </w:rPr>
-        <w:t xml:space="preserve">Ctrl </w:t>
-      </w:r>
-      <w:proofErr w:type="gramStart"/>
-      <w:r>
-        <w:rPr>
-          <w:rStyle w:val="HTMLCode"/>
-        </w:rPr>
-        <w:t>+ ,</w:t>
-      </w:r>
-      <w:proofErr w:type="gramEnd"/>
-      <w:r>
-        <w:t xml:space="preserve"> press karke Settings </w:t>
-      </w:r>
-      <w:proofErr w:type="spellStart"/>
-      <w:r>
-        <w:t>kholein</w:t>
-      </w:r>
-      <w:proofErr w:type="spellEnd"/>
-      <w:r>
-        <w:t>.</w:t>
+        <w:t>Ctrl + ,</w:t>
+      </w:r>
+      <w:r>
+        <w:t xml:space="preserve"> press karke Settings kholein.</w:t>
       </w:r>
     </w:p>
     <w:p>
@@ -1604,30 +1439,8 @@
         <w:rPr>
           <w:rStyle w:val="HTMLCode"/>
         </w:rPr>
-        <w:t xml:space="preserve">code runner </w:t>
-      </w:r>
-      <w:proofErr w:type="gramStart"/>
-      <w:r>
-        <w:rPr>
-          <w:rStyle w:val="HTMLCode"/>
-        </w:rPr>
-        <w:t>save</w:t>
-      </w:r>
-      <w:proofErr w:type="gramEnd"/>
-      <w:r>
-        <w:rPr>
-          <w:rStyle w:val="HTMLCode"/>
-        </w:rPr>
-        <w:t xml:space="preserve"> before </w:t>
-      </w:r>
-      <w:proofErr w:type="gramStart"/>
-      <w:r>
-        <w:rPr>
-          <w:rStyle w:val="HTMLCode"/>
-        </w:rPr>
-        <w:t>run</w:t>
-      </w:r>
-      <w:proofErr w:type="gramEnd"/>
+        <w:t>code runner save before run</w:t>
+      </w:r>
       <w:r>
         <w:t xml:space="preserve"> </w:t>
       </w:r>
@@ -1835,23 +1648,7 @@
         </w:numPr>
       </w:pPr>
       <w:r>
-        <w:t xml:space="preserve">Keyboard se apni </w:t>
-      </w:r>
-      <w:proofErr w:type="spellStart"/>
-      <w:r>
-        <w:t>pasand</w:t>
-      </w:r>
-      <w:proofErr w:type="spellEnd"/>
-      <w:r>
-        <w:t xml:space="preserve"> ka key combination </w:t>
-      </w:r>
-      <w:proofErr w:type="gramStart"/>
-      <w:r>
-        <w:t>press</w:t>
-      </w:r>
-      <w:proofErr w:type="gramEnd"/>
-      <w:r>
-        <w:t xml:space="preserve"> karein (e.g., </w:t>
+        <w:t xml:space="preserve">Keyboard se apni pasand ka key combination press karein (e.g., </w:t>
       </w:r>
       <w:r>
         <w:rPr>
@@ -1940,40 +1737,18 @@
           <w:bCs/>
           <w:highlight w:val="yellow"/>
         </w:rPr>
-        <w:t xml:space="preserve">Method 1: Jupyter Extension </w:t>
-      </w:r>
-      <w:proofErr w:type="gramStart"/>
-      <w:r>
-        <w:rPr>
+        <w:t>Method 1: Jupyter Extension (</w:t>
+      </w:r>
+      <w:r>
+        <w:rPr>
+          <w:rStyle w:val="HTMLCode"/>
+          <w:rFonts w:eastAsiaTheme="majorEastAsia"/>
           <w:b/>
           <w:bCs/>
           <w:highlight w:val="yellow"/>
         </w:rPr>
-        <w:t>(</w:t>
-      </w:r>
-      <w:r>
-        <w:rPr>
-          <w:rStyle w:val="HTMLCode"/>
-          <w:rFonts w:eastAsiaTheme="majorEastAsia"/>
-          <w:b/>
-          <w:bCs/>
-          <w:highlight w:val="yellow"/>
-        </w:rPr>
-        <w:t>.</w:t>
-      </w:r>
-      <w:proofErr w:type="spellStart"/>
-      <w:r>
-        <w:rPr>
-          <w:rStyle w:val="HTMLCode"/>
-          <w:rFonts w:eastAsiaTheme="majorEastAsia"/>
-          <w:b/>
-          <w:bCs/>
-          <w:highlight w:val="yellow"/>
-        </w:rPr>
-        <w:t>ipynb</w:t>
-      </w:r>
-      <w:proofErr w:type="spellEnd"/>
-      <w:proofErr w:type="gramEnd"/>
+        <w:t>.ipynb</w:t>
+      </w:r>
       <w:r>
         <w:rPr>
           <w:b/>
@@ -2066,13 +1841,8 @@
           <w:numId w:val="10"/>
         </w:numPr>
       </w:pPr>
-      <w:proofErr w:type="gramStart"/>
-      <w:r>
-        <w:t>Search</w:t>
-      </w:r>
-      <w:proofErr w:type="gramEnd"/>
-      <w:r>
-        <w:t xml:space="preserve"> karein: </w:t>
+      <w:r>
+        <w:t xml:space="preserve">Search karein: </w:t>
       </w:r>
       <w:r>
         <w:rPr>
@@ -2110,46 +1880,33 @@
           <w:numId w:val="11"/>
         </w:numPr>
       </w:pPr>
-      <w:proofErr w:type="gramStart"/>
-      <w:r>
-        <w:t>File</w:t>
-      </w:r>
-      <w:proofErr w:type="gramEnd"/>
-      <w:r>
-        <w:t xml:space="preserve"> create karein </w:t>
-      </w:r>
-      <w:proofErr w:type="gramStart"/>
-      <w:r>
-        <w:t xml:space="preserve">jise </w:t>
-      </w:r>
-      <w:r>
-        <w:rPr>
-          <w:rStyle w:val="HTMLCode"/>
-        </w:rPr>
-        <w:t>.</w:t>
-      </w:r>
-      <w:proofErr w:type="spellStart"/>
-      <w:r>
-        <w:rPr>
-          <w:rStyle w:val="HTMLCode"/>
-        </w:rPr>
-        <w:t>ipynb</w:t>
-      </w:r>
-      <w:proofErr w:type="spellEnd"/>
-      <w:proofErr w:type="gramEnd"/>
-      <w:r>
-        <w:t xml:space="preserve"> extension dein (e.g., </w:t>
-      </w:r>
-      <w:proofErr w:type="spellStart"/>
-      <w:proofErr w:type="gramStart"/>
+      <w:r>
+        <w:t xml:space="preserve">File create karein jise </w:t>
+      </w:r>
+      <w:r>
+        <w:rPr>
+          <w:rStyle w:val="HTMLCode"/>
+          <w:b/>
+          <w:bCs/>
+          <w:color w:val="EE0000"/>
+        </w:rPr>
+        <w:t>.ipynb</w:t>
+      </w:r>
+      <w:r>
+        <w:rPr>
+          <w:color w:val="EE0000"/>
+        </w:rPr>
+        <w:t xml:space="preserve"> </w:t>
+      </w:r>
+      <w:r>
+        <w:t xml:space="preserve">extension dein (e.g., </w:t>
+      </w:r>
       <w:r>
         <w:rPr>
           <w:rStyle w:val="HTMLCode"/>
         </w:rPr>
         <w:t>analysis.ipynb</w:t>
       </w:r>
-      <w:proofErr w:type="spellEnd"/>
-      <w:proofErr w:type="gramEnd"/>
       <w:r>
         <w:t>).</w:t>
       </w:r>
@@ -2248,27 +2005,17 @@
           <w:rStyle w:val="HTMLCode"/>
         </w:rPr>
       </w:pPr>
-      <w:proofErr w:type="gramStart"/>
       <w:r>
         <w:rPr>
           <w:rStyle w:val="HTMLCode"/>
         </w:rPr>
         <w:t>print(</w:t>
       </w:r>
-      <w:proofErr w:type="spellStart"/>
-      <w:proofErr w:type="gramEnd"/>
       <w:r>
         <w:rPr>
           <w:rStyle w:val="hljs-string"/>
         </w:rPr>
-        <w:t>f"Welcome</w:t>
-      </w:r>
-      <w:proofErr w:type="spellEnd"/>
-      <w:r>
-        <w:rPr>
-          <w:rStyle w:val="hljs-string"/>
-        </w:rPr>
-        <w:t xml:space="preserve"> to </w:t>
+        <w:t xml:space="preserve">f"Welcome to </w:t>
       </w:r>
       <w:r>
         <w:rPr>
@@ -2364,7 +2111,6 @@
         </w:rPr>
         <w:t xml:space="preserve">(Note: Pehli baar run karne par agar </w:t>
       </w:r>
-      <w:proofErr w:type="spellStart"/>
       <w:r>
         <w:rPr>
           <w:rStyle w:val="HTMLCode"/>
@@ -2373,7 +2119,6 @@
         </w:rPr>
         <w:t>ipykernel</w:t>
       </w:r>
-      <w:proofErr w:type="spellEnd"/>
       <w:r>
         <w:rPr>
           <w:i/>
@@ -2450,15 +2195,7 @@
         <w:t>Kyun Use Hoti Hai?</w:t>
       </w:r>
       <w:r>
-        <w:t xml:space="preserve"> Bina HTML, CSS, ya JavaScript </w:t>
-      </w:r>
-      <w:proofErr w:type="spellStart"/>
-      <w:r>
-        <w:t>seekhe</w:t>
-      </w:r>
-      <w:proofErr w:type="spellEnd"/>
-      <w:r>
-        <w:t>, sirf Python code se interactive browser dashboards, buttons, sliders, aur forms banane ke liye.</w:t>
+        <w:t xml:space="preserve"> Bina HTML, CSS, ya JavaScript seekhe, sirf Python code se interactive browser dashboards, buttons, sliders, aur forms banane ke liye.</w:t>
       </w:r>
     </w:p>
     <w:p>
@@ -2509,33 +2246,11 @@
           <w:rStyle w:val="HTMLCode"/>
         </w:rPr>
       </w:pPr>
-      <w:proofErr w:type="gramStart"/>
-      <w:r>
-        <w:rPr>
-          <w:rStyle w:val="HTMLCode"/>
-        </w:rPr>
-        <w:t>pip</w:t>
-      </w:r>
-      <w:proofErr w:type="gramEnd"/>
-      <w:r>
-        <w:rPr>
-          <w:rStyle w:val="HTMLCode"/>
-        </w:rPr>
-        <w:t xml:space="preserve"> </w:t>
-      </w:r>
-      <w:proofErr w:type="gramStart"/>
-      <w:r>
-        <w:rPr>
-          <w:rStyle w:val="HTMLCode"/>
-        </w:rPr>
-        <w:t>install</w:t>
-      </w:r>
-      <w:proofErr w:type="gramEnd"/>
-      <w:r>
-        <w:rPr>
-          <w:rStyle w:val="HTMLCode"/>
-        </w:rPr>
-        <w:t xml:space="preserve"> streamlit</w:t>
+      <w:r>
+        <w:rPr>
+          <w:rStyle w:val="HTMLCode"/>
+        </w:rPr>
+        <w:t>pip install streamlit</w:t>
       </w:r>
     </w:p>
     <w:p>
@@ -2634,21 +2349,11 @@
           <w:rStyle w:val="HTMLCode"/>
         </w:rPr>
       </w:pPr>
-      <w:proofErr w:type="spellStart"/>
-      <w:proofErr w:type="gramStart"/>
-      <w:r>
-        <w:rPr>
-          <w:rStyle w:val="HTMLCode"/>
-        </w:rPr>
-        <w:t>st.title</w:t>
-      </w:r>
-      <w:proofErr w:type="spellEnd"/>
-      <w:proofErr w:type="gramEnd"/>
-      <w:r>
-        <w:rPr>
-          <w:rStyle w:val="HTMLCode"/>
-        </w:rPr>
-        <w:t>(</w:t>
+      <w:r>
+        <w:rPr>
+          <w:rStyle w:val="HTMLCode"/>
+        </w:rPr>
+        <w:t>st.title(</w:t>
       </w:r>
       <w:r>
         <w:rPr>
@@ -2671,28 +2376,12 @@
           <w:rStyle w:val="HTMLCode"/>
         </w:rPr>
       </w:pPr>
-      <w:proofErr w:type="spellStart"/>
-      <w:r>
-        <w:rPr>
-          <w:rStyle w:val="HTMLCode"/>
-        </w:rPr>
-        <w:t>st.text_</w:t>
-      </w:r>
-      <w:proofErr w:type="gramStart"/>
-      <w:r>
-        <w:rPr>
-          <w:rStyle w:val="HTMLCode"/>
-        </w:rPr>
-        <w:t>input</w:t>
-      </w:r>
-      <w:proofErr w:type="spellEnd"/>
-      <w:r>
-        <w:rPr>
-          <w:rStyle w:val="HTMLCode"/>
-        </w:rPr>
-        <w:t>(</w:t>
-      </w:r>
-      <w:proofErr w:type="gramEnd"/>
+      <w:r>
+        <w:rPr>
+          <w:rStyle w:val="HTMLCode"/>
+        </w:rPr>
+        <w:t>st.text_input(</w:t>
+      </w:r>
       <w:r>
         <w:rPr>
           <w:rStyle w:val="hljs-string"/>
@@ -2724,23 +2413,7 @@
         <w:rPr>
           <w:rStyle w:val="HTMLCode"/>
         </w:rPr>
-        <w:t xml:space="preserve"> </w:t>
-      </w:r>
-      <w:proofErr w:type="spellStart"/>
-      <w:proofErr w:type="gramStart"/>
-      <w:r>
-        <w:rPr>
-          <w:rStyle w:val="HTMLCode"/>
-        </w:rPr>
-        <w:t>st.button</w:t>
-      </w:r>
-      <w:proofErr w:type="spellEnd"/>
-      <w:proofErr w:type="gramEnd"/>
-      <w:r>
-        <w:rPr>
-          <w:rStyle w:val="HTMLCode"/>
-        </w:rPr>
-        <w:t>(</w:t>
+        <w:t xml:space="preserve"> st.button(</w:t>
       </w:r>
       <w:r>
         <w:rPr>
@@ -2767,23 +2440,7 @@
         <w:rPr>
           <w:rStyle w:val="HTMLCode"/>
         </w:rPr>
-        <w:t xml:space="preserve">    </w:t>
-      </w:r>
-      <w:proofErr w:type="spellStart"/>
-      <w:proofErr w:type="gramStart"/>
-      <w:r>
-        <w:rPr>
-          <w:rStyle w:val="HTMLCode"/>
-        </w:rPr>
-        <w:t>st.success</w:t>
-      </w:r>
-      <w:proofErr w:type="spellEnd"/>
-      <w:proofErr w:type="gramEnd"/>
-      <w:r>
-        <w:rPr>
-          <w:rStyle w:val="HTMLCode"/>
-        </w:rPr>
-        <w:t>(</w:t>
+        <w:t xml:space="preserve">    st.success(</w:t>
       </w:r>
       <w:r>
         <w:rPr>
@@ -2807,15 +2464,7 @@
         </w:numPr>
       </w:pPr>
       <w:r>
-        <w:t xml:space="preserve">Terminal mein command </w:t>
-      </w:r>
-      <w:proofErr w:type="spellStart"/>
-      <w:r>
-        <w:t>chalayein</w:t>
-      </w:r>
-      <w:proofErr w:type="spellEnd"/>
-      <w:r>
-        <w:t>:</w:t>
+        <w:t>Terminal mein command chalayein:</w:t>
       </w:r>
     </w:p>
     <w:p>
@@ -2826,6 +2475,8 @@
       <w:r>
         <w:rPr>
           <w:rStyle w:val="ng-tns-c1274178722-134"/>
+          <w:b/>
+          <w:bCs/>
         </w:rPr>
         <w:t>Bash</w:t>
       </w:r>
@@ -2948,6 +2599,8 @@
       <w:r>
         <w:rPr>
           <w:rStyle w:val="ng-tns-c1274178722-135"/>
+          <w:b/>
+          <w:bCs/>
         </w:rPr>
         <w:t>Bash</w:t>
       </w:r>
@@ -2960,19 +2613,11 @@
           <w:rStyle w:val="HTMLCode"/>
         </w:rPr>
       </w:pPr>
-      <w:proofErr w:type="gramStart"/>
-      <w:r>
-        <w:rPr>
-          <w:rStyle w:val="HTMLCode"/>
-        </w:rPr>
-        <w:t>pip</w:t>
-      </w:r>
-      <w:proofErr w:type="gramEnd"/>
-      <w:r>
-        <w:rPr>
-          <w:rStyle w:val="HTMLCode"/>
-        </w:rPr>
-        <w:t xml:space="preserve"> install flask</w:t>
+      <w:r>
+        <w:rPr>
+          <w:rStyle w:val="HTMLCode"/>
+        </w:rPr>
+        <w:t>pip install flask</w:t>
       </w:r>
     </w:p>
     <w:p>
@@ -3017,6 +2662,8 @@
       <w:r>
         <w:rPr>
           <w:rStyle w:val="ng-tns-c1274178722-136"/>
+          <w:b/>
+          <w:bCs/>
         </w:rPr>
         <w:t>Python</w:t>
       </w:r>
@@ -3108,21 +2755,7 @@
         <w:rPr>
           <w:rStyle w:val="hljs-meta"/>
         </w:rPr>
-        <w:t>@</w:t>
-      </w:r>
-      <w:proofErr w:type="gramStart"/>
-      <w:r>
-        <w:rPr>
-          <w:rStyle w:val="hljs-meta"/>
-        </w:rPr>
-        <w:t>app.route</w:t>
-      </w:r>
-      <w:proofErr w:type="gramEnd"/>
-      <w:r>
-        <w:rPr>
-          <w:rStyle w:val="hljs-meta"/>
-        </w:rPr>
-        <w:t>(</w:t>
+        <w:t>@app.route(</w:t>
       </w:r>
       <w:r>
         <w:rPr>
@@ -3157,7 +2790,6 @@
         </w:rPr>
         <w:t xml:space="preserve"> </w:t>
       </w:r>
-      <w:proofErr w:type="gramStart"/>
       <w:r>
         <w:rPr>
           <w:rStyle w:val="hljs-title"/>
@@ -3168,14 +2800,7 @@
         <w:rPr>
           <w:rStyle w:val="hljs-function"/>
         </w:rPr>
-        <w:t>(</w:t>
-      </w:r>
-      <w:proofErr w:type="gramEnd"/>
-      <w:r>
-        <w:rPr>
-          <w:rStyle w:val="hljs-function"/>
-        </w:rPr>
-        <w:t>):</w:t>
+        <w:t>():</w:t>
       </w:r>
     </w:p>
     <w:p>
@@ -3208,37 +2833,7 @@
         <w:rPr>
           <w:rStyle w:val="hljs-string"/>
         </w:rPr>
-        <w:t>"&lt;h1 style='</w:t>
-      </w:r>
-      <w:proofErr w:type="spellStart"/>
-      <w:proofErr w:type="gramStart"/>
-      <w:r>
-        <w:rPr>
-          <w:rStyle w:val="hljs-string"/>
-        </w:rPr>
-        <w:t>color:blue</w:t>
-      </w:r>
-      <w:proofErr w:type="spellEnd"/>
-      <w:proofErr w:type="gramEnd"/>
-      <w:r>
-        <w:rPr>
-          <w:rStyle w:val="hljs-string"/>
-        </w:rPr>
-        <w:t xml:space="preserve">;'&gt;Hello World from Flask Web </w:t>
-      </w:r>
-      <w:proofErr w:type="gramStart"/>
-      <w:r>
-        <w:rPr>
-          <w:rStyle w:val="hljs-string"/>
-        </w:rPr>
-        <w:t>Server!&lt;</w:t>
-      </w:r>
-      <w:proofErr w:type="gramEnd"/>
-      <w:r>
-        <w:rPr>
-          <w:rStyle w:val="hljs-string"/>
-        </w:rPr>
-        <w:t>/h1&gt;"</w:t>
+        <w:t>"&lt;h1 style='color:blue;'&gt;Hello World from Flask Web Server!&lt;/h1&gt;"</w:t>
       </w:r>
     </w:p>
     <w:p>
@@ -3304,21 +2899,7 @@
         <w:rPr>
           <w:rStyle w:val="HTMLCode"/>
         </w:rPr>
-        <w:t xml:space="preserve">    </w:t>
-      </w:r>
-      <w:proofErr w:type="spellStart"/>
-      <w:r>
-        <w:rPr>
-          <w:rStyle w:val="HTMLCode"/>
-        </w:rPr>
-        <w:t>app.run</w:t>
-      </w:r>
-      <w:proofErr w:type="spellEnd"/>
-      <w:r>
-        <w:rPr>
-          <w:rStyle w:val="HTMLCode"/>
-        </w:rPr>
-        <w:t>(debug=</w:t>
+        <w:t xml:space="preserve">    app.run(debug=</w:t>
       </w:r>
       <w:r>
         <w:rPr>
@@ -3369,21 +2950,7 @@
         <w:rPr>
           <w:rStyle w:val="HTMLCode"/>
         </w:rPr>
-        <w:t>[</w:t>
-      </w:r>
-      <w:proofErr w:type="gramStart"/>
-      <w:r>
-        <w:rPr>
-          <w:rStyle w:val="HTMLCode"/>
-        </w:rPr>
-        <w:t>http://127.0.0.1:5000/](</w:t>
-      </w:r>
-      <w:proofErr w:type="gramEnd"/>
-      <w:r>
-        <w:rPr>
-          <w:rStyle w:val="HTMLCode"/>
-        </w:rPr>
-        <w:t>http://127.0.0.1:5000/)</w:t>
+        <w:t>[http://127.0.0.1:5000/](http://127.0.0.1:5000/)</w:t>
       </w:r>
       <w:r>
         <w:t xml:space="preserve">) aayega, us par </w:t>
@@ -3422,25 +2989,7 @@
           <w:bCs/>
           <w:highlight w:val="yellow"/>
         </w:rPr>
-        <w:t xml:space="preserve">Method 4: </w:t>
-      </w:r>
-      <w:proofErr w:type="spellStart"/>
-      <w:r>
-        <w:rPr>
-          <w:b/>
-          <w:bCs/>
-          <w:highlight w:val="yellow"/>
-        </w:rPr>
-        <w:t>Tkinter</w:t>
-      </w:r>
-      <w:proofErr w:type="spellEnd"/>
-      <w:r>
-        <w:rPr>
-          <w:b/>
-          <w:bCs/>
-          <w:highlight w:val="yellow"/>
-        </w:rPr>
-        <w:t xml:space="preserve"> (Standard Desktop Window GUI)</w:t>
+        <w:t>Method 4: Tkinter (Standard Desktop Window GUI)</w:t>
       </w:r>
     </w:p>
     <w:p>
@@ -3535,33 +3084,17 @@
           <w:rStyle w:val="HTMLCode"/>
         </w:rPr>
       </w:pPr>
-      <w:proofErr w:type="gramStart"/>
       <w:r>
         <w:rPr>
           <w:rStyle w:val="hljs-keyword"/>
         </w:rPr>
         <w:t>import</w:t>
       </w:r>
-      <w:proofErr w:type="gramEnd"/>
-      <w:r>
-        <w:rPr>
-          <w:rStyle w:val="HTMLCode"/>
-        </w:rPr>
-        <w:t xml:space="preserve"> </w:t>
-      </w:r>
-      <w:proofErr w:type="spellStart"/>
-      <w:r>
-        <w:rPr>
-          <w:rStyle w:val="HTMLCode"/>
-        </w:rPr>
-        <w:t>tkinter</w:t>
-      </w:r>
-      <w:proofErr w:type="spellEnd"/>
-      <w:r>
-        <w:rPr>
-          <w:rStyle w:val="HTMLCode"/>
-        </w:rPr>
-        <w:t xml:space="preserve"> </w:t>
+      <w:r>
+        <w:rPr>
+          <w:rStyle w:val="HTMLCode"/>
+        </w:rPr>
+        <w:t xml:space="preserve"> tkinter </w:t>
       </w:r>
       <w:r>
         <w:rPr>
@@ -3573,16 +3106,8 @@
         <w:rPr>
           <w:rStyle w:val="HTMLCode"/>
         </w:rPr>
-        <w:t xml:space="preserve"> </w:t>
-      </w:r>
-      <w:proofErr w:type="spellStart"/>
-      <w:r>
-        <w:rPr>
-          <w:rStyle w:val="HTMLCode"/>
-        </w:rPr>
-        <w:t>tk</w:t>
-      </w:r>
-      <w:proofErr w:type="spellEnd"/>
+        <w:t xml:space="preserve"> tk</w:t>
+      </w:r>
     </w:p>
     <w:p>
       <w:pPr>
@@ -3602,21 +3127,7 @@
         <w:rPr>
           <w:rStyle w:val="HTMLCode"/>
         </w:rPr>
-        <w:t xml:space="preserve"> </w:t>
-      </w:r>
-      <w:proofErr w:type="spellStart"/>
-      <w:r>
-        <w:rPr>
-          <w:rStyle w:val="HTMLCode"/>
-        </w:rPr>
-        <w:t>tkinter</w:t>
-      </w:r>
-      <w:proofErr w:type="spellEnd"/>
-      <w:r>
-        <w:rPr>
-          <w:rStyle w:val="HTMLCode"/>
-        </w:rPr>
-        <w:t xml:space="preserve"> </w:t>
+        <w:t xml:space="preserve"> tkinter </w:t>
       </w:r>
       <w:r>
         <w:rPr>
@@ -3628,16 +3139,8 @@
         <w:rPr>
           <w:rStyle w:val="HTMLCode"/>
         </w:rPr>
-        <w:t xml:space="preserve"> </w:t>
-      </w:r>
-      <w:proofErr w:type="spellStart"/>
-      <w:r>
-        <w:rPr>
-          <w:rStyle w:val="HTMLCode"/>
-        </w:rPr>
-        <w:t>messagebox</w:t>
-      </w:r>
-      <w:proofErr w:type="spellEnd"/>
+        <w:t xml:space="preserve"> messagebox</w:t>
+      </w:r>
     </w:p>
     <w:p>
       <w:pPr>
@@ -3677,33 +3180,17 @@
         </w:rPr>
         <w:t xml:space="preserve"> </w:t>
       </w:r>
-      <w:proofErr w:type="spellStart"/>
       <w:r>
         <w:rPr>
           <w:rStyle w:val="hljs-title"/>
         </w:rPr>
-        <w:t>show_</w:t>
-      </w:r>
-      <w:proofErr w:type="gramStart"/>
-      <w:r>
-        <w:rPr>
-          <w:rStyle w:val="hljs-title"/>
-        </w:rPr>
-        <w:t>message</w:t>
-      </w:r>
-      <w:proofErr w:type="spellEnd"/>
+        <w:t>show_message</w:t>
+      </w:r>
       <w:r>
         <w:rPr>
           <w:rStyle w:val="hljs-function"/>
         </w:rPr>
-        <w:t>(</w:t>
-      </w:r>
-      <w:proofErr w:type="gramEnd"/>
-      <w:r>
-        <w:rPr>
-          <w:rStyle w:val="hljs-function"/>
-        </w:rPr>
-        <w:t>):</w:t>
+        <w:t>():</w:t>
       </w:r>
     </w:p>
     <w:p>
@@ -3718,23 +3205,7 @@
         <w:rPr>
           <w:rStyle w:val="HTMLCode"/>
         </w:rPr>
-        <w:t xml:space="preserve">    </w:t>
-      </w:r>
-      <w:proofErr w:type="spellStart"/>
-      <w:proofErr w:type="gramStart"/>
-      <w:r>
-        <w:rPr>
-          <w:rStyle w:val="HTMLCode"/>
-        </w:rPr>
-        <w:t>messagebox.showinfo</w:t>
-      </w:r>
-      <w:proofErr w:type="spellEnd"/>
-      <w:proofErr w:type="gramEnd"/>
-      <w:r>
-        <w:rPr>
-          <w:rStyle w:val="HTMLCode"/>
-        </w:rPr>
-        <w:t>(</w:t>
+        <w:t xml:space="preserve">    messagebox.showinfo(</w:t>
       </w:r>
       <w:r>
         <w:rPr>
@@ -3791,23 +3262,7 @@
         <w:rPr>
           <w:rStyle w:val="HTMLCode"/>
         </w:rPr>
-        <w:t xml:space="preserve">root = </w:t>
-      </w:r>
-      <w:proofErr w:type="spellStart"/>
-      <w:proofErr w:type="gramStart"/>
-      <w:r>
-        <w:rPr>
-          <w:rStyle w:val="HTMLCode"/>
-        </w:rPr>
-        <w:t>tk.Tk</w:t>
-      </w:r>
-      <w:proofErr w:type="spellEnd"/>
-      <w:proofErr w:type="gramEnd"/>
-      <w:r>
-        <w:rPr>
-          <w:rStyle w:val="HTMLCode"/>
-        </w:rPr>
-        <w:t>()</w:t>
+        <w:t>root = tk.Tk()</w:t>
       </w:r>
     </w:p>
     <w:p>
@@ -3818,21 +3273,11 @@
           <w:rStyle w:val="HTMLCode"/>
         </w:rPr>
       </w:pPr>
-      <w:proofErr w:type="spellStart"/>
-      <w:proofErr w:type="gramStart"/>
-      <w:r>
-        <w:rPr>
-          <w:rStyle w:val="HTMLCode"/>
-        </w:rPr>
-        <w:t>root.title</w:t>
-      </w:r>
-      <w:proofErr w:type="spellEnd"/>
-      <w:proofErr w:type="gramEnd"/>
-      <w:r>
-        <w:rPr>
-          <w:rStyle w:val="HTMLCode"/>
-        </w:rPr>
-        <w:t>(</w:t>
+      <w:r>
+        <w:rPr>
+          <w:rStyle w:val="HTMLCode"/>
+        </w:rPr>
+        <w:t>root.title(</w:t>
       </w:r>
       <w:r>
         <w:rPr>
@@ -3855,21 +3300,11 @@
           <w:rStyle w:val="HTMLCode"/>
         </w:rPr>
       </w:pPr>
-      <w:proofErr w:type="spellStart"/>
-      <w:proofErr w:type="gramStart"/>
-      <w:r>
-        <w:rPr>
-          <w:rStyle w:val="HTMLCode"/>
-        </w:rPr>
-        <w:t>root.geometry</w:t>
-      </w:r>
-      <w:proofErr w:type="spellEnd"/>
-      <w:proofErr w:type="gramEnd"/>
-      <w:r>
-        <w:rPr>
-          <w:rStyle w:val="HTMLCode"/>
-        </w:rPr>
-        <w:t>(</w:t>
+      <w:r>
+        <w:rPr>
+          <w:rStyle w:val="HTMLCode"/>
+        </w:rPr>
+        <w:t>root.geometry(</w:t>
       </w:r>
       <w:r>
         <w:rPr>
@@ -3905,23 +3340,7 @@
         <w:rPr>
           <w:rStyle w:val="HTMLCode"/>
         </w:rPr>
-        <w:t xml:space="preserve">btn = </w:t>
-      </w:r>
-      <w:proofErr w:type="spellStart"/>
-      <w:proofErr w:type="gramStart"/>
-      <w:r>
-        <w:rPr>
-          <w:rStyle w:val="HTMLCode"/>
-        </w:rPr>
-        <w:t>tk.Button</w:t>
-      </w:r>
-      <w:proofErr w:type="spellEnd"/>
-      <w:proofErr w:type="gramEnd"/>
-      <w:r>
-        <w:rPr>
-          <w:rStyle w:val="HTMLCode"/>
-        </w:rPr>
-        <w:t>(root, text=</w:t>
+        <w:t>btn = tk.Button(root, text=</w:t>
       </w:r>
       <w:r>
         <w:rPr>
@@ -3933,21 +3352,7 @@
         <w:rPr>
           <w:rStyle w:val="HTMLCode"/>
         </w:rPr>
-        <w:t>, command=</w:t>
-      </w:r>
-      <w:proofErr w:type="spellStart"/>
-      <w:r>
-        <w:rPr>
-          <w:rStyle w:val="HTMLCode"/>
-        </w:rPr>
-        <w:t>show_message</w:t>
-      </w:r>
-      <w:proofErr w:type="spellEnd"/>
-      <w:r>
-        <w:rPr>
-          <w:rStyle w:val="HTMLCode"/>
-        </w:rPr>
-        <w:t>)</w:t>
+        <w:t>, command=show_message)</w:t>
       </w:r>
     </w:p>
     <w:p>
@@ -3958,35 +3363,11 @@
           <w:rStyle w:val="HTMLCode"/>
         </w:rPr>
       </w:pPr>
-      <w:proofErr w:type="spellStart"/>
-      <w:proofErr w:type="gramStart"/>
-      <w:r>
-        <w:rPr>
-          <w:rStyle w:val="HTMLCode"/>
-        </w:rPr>
-        <w:t>btn.pack</w:t>
-      </w:r>
-      <w:proofErr w:type="spellEnd"/>
-      <w:proofErr w:type="gramEnd"/>
-      <w:r>
-        <w:rPr>
-          <w:rStyle w:val="HTMLCode"/>
-        </w:rPr>
-        <w:t>(</w:t>
-      </w:r>
-      <w:proofErr w:type="spellStart"/>
-      <w:r>
-        <w:rPr>
-          <w:rStyle w:val="HTMLCode"/>
-        </w:rPr>
-        <w:t>pady</w:t>
-      </w:r>
-      <w:proofErr w:type="spellEnd"/>
-      <w:r>
-        <w:rPr>
-          <w:rStyle w:val="HTMLCode"/>
-        </w:rPr>
-        <w:t>=</w:t>
+      <w:r>
+        <w:rPr>
+          <w:rStyle w:val="HTMLCode"/>
+        </w:rPr>
+        <w:t>btn.pack(pady=</w:t>
       </w:r>
       <w:r>
         <w:rPr>
@@ -4018,21 +3399,11 @@
           <w:rStyle w:val="HTMLCode"/>
         </w:rPr>
       </w:pPr>
-      <w:proofErr w:type="spellStart"/>
-      <w:proofErr w:type="gramStart"/>
-      <w:r>
-        <w:rPr>
-          <w:rStyle w:val="HTMLCode"/>
-        </w:rPr>
-        <w:t>root.mainloop</w:t>
-      </w:r>
-      <w:proofErr w:type="spellEnd"/>
-      <w:proofErr w:type="gramEnd"/>
-      <w:r>
-        <w:rPr>
-          <w:rStyle w:val="HTMLCode"/>
-        </w:rPr>
-        <w:t>()</w:t>
+      <w:r>
+        <w:rPr>
+          <w:rStyle w:val="HTMLCode"/>
+        </w:rPr>
+        <w:t>root.mainloop()</w:t>
       </w:r>
     </w:p>
     <w:p>
@@ -4094,7 +3465,6 @@
         </w:rPr>
         <w:t>1. Virtual Environments (</w:t>
       </w:r>
-      <w:proofErr w:type="spellStart"/>
       <w:r>
         <w:rPr>
           <w:rStyle w:val="HTMLCode"/>
@@ -4105,7 +3475,6 @@
         </w:rPr>
         <w:t>venv</w:t>
       </w:r>
-      <w:proofErr w:type="spellEnd"/>
       <w:r>
         <w:rPr>
           <w:b/>
@@ -4158,6 +3527,8 @@
       <w:r>
         <w:rPr>
           <w:rStyle w:val="ng-tns-c1274178722-138"/>
+          <w:b/>
+          <w:bCs/>
         </w:rPr>
         <w:t>Bash</w:t>
       </w:r>
@@ -4174,30 +3545,8 @@
         <w:rPr>
           <w:rStyle w:val="HTMLCode"/>
         </w:rPr>
-        <w:t xml:space="preserve">python -m </w:t>
-      </w:r>
-      <w:proofErr w:type="spellStart"/>
-      <w:r>
-        <w:rPr>
-          <w:rStyle w:val="HTMLCode"/>
-        </w:rPr>
-        <w:t>venv</w:t>
-      </w:r>
-      <w:proofErr w:type="spellEnd"/>
-      <w:r>
-        <w:rPr>
-          <w:rStyle w:val="HTMLCode"/>
-        </w:rPr>
-        <w:t xml:space="preserve"> </w:t>
-      </w:r>
-      <w:proofErr w:type="spellStart"/>
-      <w:r>
-        <w:rPr>
-          <w:rStyle w:val="HTMLCode"/>
-        </w:rPr>
-        <w:t>myenv</w:t>
-      </w:r>
-      <w:proofErr w:type="spellEnd"/>
+        <w:t>python -m venv myenv</w:t>
+      </w:r>
     </w:p>
     <w:p>
       <w:pPr>
@@ -4223,6 +3572,8 @@
       <w:r>
         <w:rPr>
           <w:rStyle w:val="ng-tns-c1274178722-139"/>
+          <w:b/>
+          <w:bCs/>
         </w:rPr>
         <w:t>Bash</w:t>
       </w:r>
@@ -4235,28 +3586,12 @@
           <w:rStyle w:val="HTMLCode"/>
         </w:rPr>
       </w:pPr>
-      <w:proofErr w:type="gramStart"/>
-      <w:r>
-        <w:rPr>
-          <w:rStyle w:val="HTMLCode"/>
-        </w:rPr>
-        <w:t>.\</w:t>
-      </w:r>
-      <w:proofErr w:type="spellStart"/>
-      <w:r>
-        <w:rPr>
-          <w:rStyle w:val="HTMLCode"/>
-        </w:rPr>
-        <w:t>myenv</w:t>
-      </w:r>
-      <w:proofErr w:type="spellEnd"/>
-      <w:r>
-        <w:rPr>
-          <w:rStyle w:val="HTMLCode"/>
-        </w:rPr>
-        <w:t>\Scripts\activate</w:t>
-      </w:r>
-      <w:proofErr w:type="gramEnd"/>
+      <w:r>
+        <w:rPr>
+          <w:rStyle w:val="HTMLCode"/>
+        </w:rPr>
+        <w:t>.\myenv\Scripts\activate</w:t>
+      </w:r>
     </w:p>
     <w:p>
       <w:pPr>
@@ -4276,38 +3611,20 @@
           <w:i/>
           <w:iCs/>
         </w:rPr>
-        <w:t>(</w:t>
-      </w:r>
-      <w:proofErr w:type="spellStart"/>
-      <w:r>
-        <w:rPr>
-          <w:rStyle w:val="HTMLCode"/>
+        <w:t>(myenv)</w:t>
+      </w:r>
+      <w:r>
+        <w:rPr>
           <w:i/>
           <w:iCs/>
         </w:rPr>
-        <w:t>myenv</w:t>
-      </w:r>
-      <w:proofErr w:type="spellEnd"/>
-      <w:r>
-        <w:rPr>
-          <w:rStyle w:val="HTMLCode"/>
+        <w:t xml:space="preserve"> likha aa jaye ga).</w:t>
+      </w:r>
+      <w:r>
+        <w:rPr>
           <w:i/>
           <w:iCs/>
         </w:rPr>
-        <w:t>)</w:t>
-      </w:r>
-      <w:r>
-        <w:rPr>
-          <w:i/>
-          <w:iCs/>
-        </w:rPr>
-        <w:t xml:space="preserve"> likha aa jaye ga).</w:t>
-      </w:r>
-      <w:r>
-        <w:rPr>
-          <w:i/>
-          <w:iCs/>
-        </w:rPr>
         <w:br/>
       </w:r>
     </w:p>
@@ -4376,21 +3693,7 @@
         <w:rPr>
           <w:rStyle w:val="HTMLCode"/>
         </w:rPr>
-        <w:t>pip install &lt;</w:t>
-      </w:r>
-      <w:proofErr w:type="spellStart"/>
-      <w:r>
-        <w:rPr>
-          <w:rStyle w:val="HTMLCode"/>
-        </w:rPr>
-        <w:t>package_name</w:t>
-      </w:r>
-      <w:proofErr w:type="spellEnd"/>
-      <w:r>
-        <w:rPr>
-          <w:rStyle w:val="HTMLCode"/>
-        </w:rPr>
-        <w:t>&gt;</w:t>
+        <w:t>pip install &lt;package_name&gt;</w:t>
       </w:r>
     </w:p>
     <w:p>
@@ -4442,6 +3745,8 @@
       <w:r>
         <w:rPr>
           <w:rStyle w:val="ng-tns-c1274178722-140"/>
+          <w:b/>
+          <w:bCs/>
         </w:rPr>
         <w:t>Bash</w:t>
       </w:r>
@@ -4548,15 +3853,7 @@
         </w:numPr>
       </w:pPr>
       <w:r>
-        <w:t xml:space="preserve">Yeh command </w:t>
-      </w:r>
-      <w:proofErr w:type="gramStart"/>
-      <w:r>
-        <w:t>execute</w:t>
-      </w:r>
-      <w:proofErr w:type="gramEnd"/>
-      <w:r>
-        <w:t xml:space="preserve"> karein:</w:t>
+        <w:t>Yeh command execute karein:</w:t>
       </w:r>
     </w:p>
     <w:p>
@@ -4567,6 +3864,8 @@
       <w:r>
         <w:rPr>
           <w:rStyle w:val="ng-tns-c1274178722-141"/>
+          <w:b/>
+          <w:bCs/>
         </w:rPr>
         <w:t>PowerShell</w:t>
       </w:r>
@@ -4583,16 +3882,8 @@
         <w:rPr>
           <w:rStyle w:val="hljs-builtin"/>
         </w:rPr>
-        <w:t>Set-</w:t>
-      </w:r>
-      <w:proofErr w:type="spellStart"/>
-      <w:r>
-        <w:rPr>
-          <w:rStyle w:val="hljs-builtin"/>
-        </w:rPr>
-        <w:t>ExecutionPolicy</w:t>
-      </w:r>
-      <w:proofErr w:type="spellEnd"/>
+        <w:t>Set-ExecutionPolicy</w:t>
+      </w:r>
       <w:r>
         <w:rPr>
           <w:rStyle w:val="HTMLCode"/>
@@ -4603,16 +3894,8 @@
         <w:rPr>
           <w:rStyle w:val="hljs-literal"/>
         </w:rPr>
-        <w:t>-</w:t>
-      </w:r>
-      <w:proofErr w:type="spellStart"/>
-      <w:r>
-        <w:rPr>
-          <w:rStyle w:val="hljs-literal"/>
-        </w:rPr>
-        <w:t>ExecutionPolicy</w:t>
-      </w:r>
-      <w:proofErr w:type="spellEnd"/>
+        <w:t>-ExecutionPolicy</w:t>
+      </w:r>
       <w:r>
         <w:rPr>
           <w:rStyle w:val="HTMLCode"/>
@@ -4927,17 +4210,8 @@
                 <w:rStyle w:val="HTMLCode"/>
                 <w:rFonts w:eastAsiaTheme="minorHAnsi"/>
               </w:rPr>
-              <w:t>.</w:t>
+              <w:t>.ipynb</w:t>
             </w:r>
-            <w:proofErr w:type="spellStart"/>
-            <w:r>
-              <w:rPr>
-                <w:rStyle w:val="HTMLCode"/>
-                <w:rFonts w:eastAsiaTheme="minorHAnsi"/>
-              </w:rPr>
-              <w:t>ipynb</w:t>
-            </w:r>
-            <w:proofErr w:type="spellEnd"/>
             <w:proofErr w:type="gramEnd"/>
             <w:r>
               <w:t>)</w:t>
@@ -5073,11 +4347,9 @@
             <w:hideMark/>
           </w:tcPr>
           <w:p>
-            <w:proofErr w:type="spellStart"/>
             <w:r>
               <w:t>Tkinter</w:t>
             </w:r>
-            <w:proofErr w:type="spellEnd"/>
           </w:p>
         </w:tc>
         <w:tc>
@@ -5095,13 +4367,300 @@
     </w:tbl>
     <w:p/>
     <w:sectPr>
+      <w:headerReference w:type="even" r:id="rId8"/>
+      <w:headerReference w:type="default" r:id="rId9"/>
+      <w:footerReference w:type="even" r:id="rId10"/>
+      <w:footerReference w:type="default" r:id="rId11"/>
+      <w:headerReference w:type="first" r:id="rId12"/>
+      <w:footerReference w:type="first" r:id="rId13"/>
       <w:pgSz w:w="12240" w:h="15840"/>
       <w:pgMar w:top="1440" w:right="1440" w:bottom="1440" w:left="1440" w:header="720" w:footer="720" w:gutter="0"/>
+      <w:pgBorders w:offsetFrom="page">
+        <w:top w:val="single" w:sz="4" w:space="24" w:color="auto" w:shadow="1"/>
+        <w:left w:val="single" w:sz="4" w:space="24" w:color="auto" w:shadow="1"/>
+        <w:bottom w:val="single" w:sz="4" w:space="24" w:color="auto" w:shadow="1"/>
+        <w:right w:val="single" w:sz="4" w:space="24" w:color="auto" w:shadow="1"/>
+      </w:pgBorders>
       <w:cols w:space="720"/>
       <w:docGrid w:linePitch="360"/>
     </w:sectPr>
   </w:body>
 </w:document>
+</file>
+
+<file path=word/endnotes.xml><?xml version="1.0" encoding="utf-8"?>
+<w:endnotes xmlns:wpc="http://schemas.microsoft.com/office/word/2010/wordprocessingCanvas" xmlns:cx="http://schemas.microsoft.com/office/drawing/2014/chartex" xmlns:cx1="http://schemas.microsoft.com/office/drawing/2015/9/8/chartex" xmlns:cx2="http://schemas.microsoft.com/office/drawing/2015/10/21/chartex" xmlns:cx3="http://schemas.microsoft.com/office/drawing/2016/5/9/chartex" xmlns:cx4="http://schemas.microsoft.com/office/drawing/2016/5/10/chartex" xmlns:cx5="http://schemas.microsoft.com/office/drawing/2016/5/11/chartex" xmlns:cx6="http://schemas.microsoft.com/office/drawing/2016/5/12/chartex" xmlns:cx7="http://schemas.microsoft.com/office/drawing/2016/5/13/chartex" xmlns:cx8="http://schemas.microsoft.com/office/drawing/2016/5/14/chartex" xmlns:mc="http://schemas.openxmlformats.org/markup-compatibility/2006" xmlns:aink="http://schemas.microsoft.com/office/drawing/2016/ink" xmlns:am3d="http://schemas.microsoft.com/office/drawing/2017/model3d" xmlns:o="urn:schemas-microsoft-com:office:office" xmlns:oel="http://schemas.microsoft.com/office/2019/extlst" xmlns:r="http://schemas.openxmlformats.org/officeDocument/2006/relationships" xmlns:m="http://schemas.openxmlformats.org/officeDocument/2006/math" xmlns:v="urn:schemas-microsoft-com:vml" xmlns:wp14="http://schemas.microsoft.com/office/word/2010/wordprocessingDrawing" xmlns:wp="http://schemas.openxmlformats.org/drawingml/2006/wordprocessingDrawing" xmlns:w10="urn:schemas-microsoft-com:office:word" xmlns:w="http://schemas.openxmlformats.org/wordprocessingml/2006/main" xmlns:w14="http://schemas.microsoft.com/office/word/2010/wordml" xmlns:w15="http://schemas.microsoft.com/office/word/2012/wordml" xmlns:w16cei="http://schemas.microsoft.com/office/word/2026/wordml/cei" xmlns:w16cex="http://schemas.microsoft.com/office/word/2018/wordml/cex" xmlns:w16cid="http://schemas.microsoft.com/office/word/2016/wordml/cid" xmlns:w16="http://schemas.microsoft.com/office/word/2018/wordml" xmlns:w16du="http://schemas.microsoft.com/office/word/2023/wordml/word16du" xmlns:w16sdtdh="http://schemas.microsoft.com/office/word/2020/wordml/sdtdatahash" xmlns:w16sdtfl="http://schemas.microsoft.com/office/word/2024/wordml/sdtformatlock" xmlns:w16se="http://schemas.microsoft.com/office/word/2015/wordml/symex" xmlns:wpg="http://schemas.microsoft.com/office/word/2010/wordprocessingGroup" xmlns:wpi="http://schemas.microsoft.com/office/word/2010/wordprocessingInk" xmlns:wne="http://schemas.microsoft.com/office/word/2006/wordml" xmlns:wps="http://schemas.microsoft.com/office/word/2010/wordprocessingShape" mc:Ignorable="w14 w15 w16se w16cid w16 w16cex w16sdtdh w16sdtfl w16du wp14">
+  <w:endnote w:type="separator" w:id="-1">
+    <w:p>
+      <w:pPr>
+        <w:spacing w:after="0" w:line="240" w:lineRule="auto"/>
+      </w:pPr>
+      <w:r>
+        <w:separator/>
+      </w:r>
+    </w:p>
+  </w:endnote>
+  <w:endnote w:type="continuationSeparator" w:id="0">
+    <w:p>
+      <w:pPr>
+        <w:spacing w:after="0" w:line="240" w:lineRule="auto"/>
+      </w:pPr>
+      <w:r>
+        <w:continuationSeparator/>
+      </w:r>
+    </w:p>
+  </w:endnote>
+</w:endnotes>
+</file>
+
+<file path=word/footer1.xml><?xml version="1.0" encoding="utf-8"?>
+<w:ftr xmlns:wpc="http://schemas.microsoft.com/office/word/2010/wordprocessingCanvas" xmlns:cx="http://schemas.microsoft.com/office/drawing/2014/chartex" xmlns:cx1="http://schemas.microsoft.com/office/drawing/2015/9/8/chartex" xmlns:cx2="http://schemas.microsoft.com/office/drawing/2015/10/21/chartex" xmlns:cx3="http://schemas.microsoft.com/office/drawing/2016/5/9/chartex" xmlns:cx4="http://schemas.microsoft.com/office/drawing/2016/5/10/chartex" xmlns:cx5="http://schemas.microsoft.com/office/drawing/2016/5/11/chartex" xmlns:cx6="http://schemas.microsoft.com/office/drawing/2016/5/12/chartex" xmlns:cx7="http://schemas.microsoft.com/office/drawing/2016/5/13/chartex" xmlns:cx8="http://schemas.microsoft.com/office/drawing/2016/5/14/chartex" xmlns:mc="http://schemas.openxmlformats.org/markup-compatibility/2006" xmlns:aink="http://schemas.microsoft.com/office/drawing/2016/ink" xmlns:am3d="http://schemas.microsoft.com/office/drawing/2017/model3d" xmlns:o="urn:schemas-microsoft-com:office:office" xmlns:oel="http://schemas.microsoft.com/office/2019/extlst" xmlns:r="http://schemas.openxmlformats.org/officeDocument/2006/relationships" xmlns:m="http://schemas.openxmlformats.org/officeDocument/2006/math" xmlns:v="urn:schemas-microsoft-com:vml" xmlns:wp14="http://schemas.microsoft.com/office/word/2010/wordprocessingDrawing" xmlns:wp="http://schemas.openxmlformats.org/drawingml/2006/wordprocessingDrawing" xmlns:w10="urn:schemas-microsoft-com:office:word" xmlns:w="http://schemas.openxmlformats.org/wordprocessingml/2006/main" xmlns:w14="http://schemas.microsoft.com/office/word/2010/wordml" xmlns:w15="http://schemas.microsoft.com/office/word/2012/wordml" xmlns:w16cei="http://schemas.microsoft.com/office/word/2026/wordml/cei" xmlns:w16cex="http://schemas.microsoft.com/office/word/2018/wordml/cex" xmlns:w16cid="http://schemas.microsoft.com/office/word/2016/wordml/cid" xmlns:w16="http://schemas.microsoft.com/office/word/2018/wordml" xmlns:w16du="http://schemas.microsoft.com/office/word/2023/wordml/word16du" xmlns:w16sdtdh="http://schemas.microsoft.com/office/word/2020/wordml/sdtdatahash" xmlns:w16sdtfl="http://schemas.microsoft.com/office/word/2024/wordml/sdtformatlock" xmlns:w16se="http://schemas.microsoft.com/office/word/2015/wordml/symex" xmlns:wpg="http://schemas.microsoft.com/office/word/2010/wordprocessingGroup" xmlns:wpi="http://schemas.microsoft.com/office/word/2010/wordprocessingInk" xmlns:wne="http://schemas.microsoft.com/office/word/2006/wordml" xmlns:wps="http://schemas.microsoft.com/office/word/2010/wordprocessingShape" mc:Ignorable="w14 w15 w16se w16cid w16 w16cex w16sdtdh w16sdtfl w16du wp14">
+  <w:p>
+    <w:pPr>
+      <w:pStyle w:val="Footer"/>
+    </w:pPr>
+  </w:p>
+</w:ftr>
+</file>
+
+<file path=word/footer2.xml><?xml version="1.0" encoding="utf-8"?>
+<w:ftr xmlns:wpc="http://schemas.microsoft.com/office/word/2010/wordprocessingCanvas" xmlns:cx="http://schemas.microsoft.com/office/drawing/2014/chartex" xmlns:cx1="http://schemas.microsoft.com/office/drawing/2015/9/8/chartex" xmlns:cx2="http://schemas.microsoft.com/office/drawing/2015/10/21/chartex" xmlns:cx3="http://schemas.microsoft.com/office/drawing/2016/5/9/chartex" xmlns:cx4="http://schemas.microsoft.com/office/drawing/2016/5/10/chartex" xmlns:cx5="http://schemas.microsoft.com/office/drawing/2016/5/11/chartex" xmlns:cx6="http://schemas.microsoft.com/office/drawing/2016/5/12/chartex" xmlns:cx7="http://schemas.microsoft.com/office/drawing/2016/5/13/chartex" xmlns:cx8="http://schemas.microsoft.com/office/drawing/2016/5/14/chartex" xmlns:mc="http://schemas.openxmlformats.org/markup-compatibility/2006" xmlns:aink="http://schemas.microsoft.com/office/drawing/2016/ink" xmlns:am3d="http://schemas.microsoft.com/office/drawing/2017/model3d" xmlns:o="urn:schemas-microsoft-com:office:office" xmlns:oel="http://schemas.microsoft.com/office/2019/extlst" xmlns:r="http://schemas.openxmlformats.org/officeDocument/2006/relationships" xmlns:m="http://schemas.openxmlformats.org/officeDocument/2006/math" xmlns:v="urn:schemas-microsoft-com:vml" xmlns:wp14="http://schemas.microsoft.com/office/word/2010/wordprocessingDrawing" xmlns:wp="http://schemas.openxmlformats.org/drawingml/2006/wordprocessingDrawing" xmlns:w10="urn:schemas-microsoft-com:office:word" xmlns:w="http://schemas.openxmlformats.org/wordprocessingml/2006/main" xmlns:w14="http://schemas.microsoft.com/office/word/2010/wordml" xmlns:w15="http://schemas.microsoft.com/office/word/2012/wordml" xmlns:w16cei="http://schemas.microsoft.com/office/word/2026/wordml/cei" xmlns:w16cex="http://schemas.microsoft.com/office/word/2018/wordml/cex" xmlns:w16cid="http://schemas.microsoft.com/office/word/2016/wordml/cid" xmlns:w16="http://schemas.microsoft.com/office/word/2018/wordml" xmlns:w16du="http://schemas.microsoft.com/office/word/2023/wordml/word16du" xmlns:w16sdtdh="http://schemas.microsoft.com/office/word/2020/wordml/sdtdatahash" xmlns:w16sdtfl="http://schemas.microsoft.com/office/word/2024/wordml/sdtformatlock" xmlns:w16se="http://schemas.microsoft.com/office/word/2015/wordml/symex" xmlns:wpg="http://schemas.microsoft.com/office/word/2010/wordprocessingGroup" xmlns:wpi="http://schemas.microsoft.com/office/word/2010/wordprocessingInk" xmlns:wne="http://schemas.microsoft.com/office/word/2006/wordml" xmlns:wps="http://schemas.microsoft.com/office/word/2010/wordprocessingShape" mc:Ignorable="w14 w15 w16se w16cid w16 w16cex w16sdtdh w16sdtfl w16du wp14">
+  <w:p>
+    <w:pPr>
+      <w:pStyle w:val="Footer"/>
+    </w:pPr>
+  </w:p>
+</w:ftr>
+</file>
+
+<file path=word/footer3.xml><?xml version="1.0" encoding="utf-8"?>
+<w:ftr xmlns:wpc="http://schemas.microsoft.com/office/word/2010/wordprocessingCanvas" xmlns:cx="http://schemas.microsoft.com/office/drawing/2014/chartex" xmlns:cx1="http://schemas.microsoft.com/office/drawing/2015/9/8/chartex" xmlns:cx2="http://schemas.microsoft.com/office/drawing/2015/10/21/chartex" xmlns:cx3="http://schemas.microsoft.com/office/drawing/2016/5/9/chartex" xmlns:cx4="http://schemas.microsoft.com/office/drawing/2016/5/10/chartex" xmlns:cx5="http://schemas.microsoft.com/office/drawing/2016/5/11/chartex" xmlns:cx6="http://schemas.microsoft.com/office/drawing/2016/5/12/chartex" xmlns:cx7="http://schemas.microsoft.com/office/drawing/2016/5/13/chartex" xmlns:cx8="http://schemas.microsoft.com/office/drawing/2016/5/14/chartex" xmlns:mc="http://schemas.openxmlformats.org/markup-compatibility/2006" xmlns:aink="http://schemas.microsoft.com/office/drawing/2016/ink" xmlns:am3d="http://schemas.microsoft.com/office/drawing/2017/model3d" xmlns:o="urn:schemas-microsoft-com:office:office" xmlns:oel="http://schemas.microsoft.com/office/2019/extlst" xmlns:r="http://schemas.openxmlformats.org/officeDocument/2006/relationships" xmlns:m="http://schemas.openxmlformats.org/officeDocument/2006/math" xmlns:v="urn:schemas-microsoft-com:vml" xmlns:wp14="http://schemas.microsoft.com/office/word/2010/wordprocessingDrawing" xmlns:wp="http://schemas.openxmlformats.org/drawingml/2006/wordprocessingDrawing" xmlns:w10="urn:schemas-microsoft-com:office:word" xmlns:w="http://schemas.openxmlformats.org/wordprocessingml/2006/main" xmlns:w14="http://schemas.microsoft.com/office/word/2010/wordml" xmlns:w15="http://schemas.microsoft.com/office/word/2012/wordml" xmlns:w16cei="http://schemas.microsoft.com/office/word/2026/wordml/cei" xmlns:w16cex="http://schemas.microsoft.com/office/word/2018/wordml/cex" xmlns:w16cid="http://schemas.microsoft.com/office/word/2016/wordml/cid" xmlns:w16="http://schemas.microsoft.com/office/word/2018/wordml" xmlns:w16du="http://schemas.microsoft.com/office/word/2023/wordml/word16du" xmlns:w16sdtdh="http://schemas.microsoft.com/office/word/2020/wordml/sdtdatahash" xmlns:w16sdtfl="http://schemas.microsoft.com/office/word/2024/wordml/sdtformatlock" xmlns:w16se="http://schemas.microsoft.com/office/word/2015/wordml/symex" xmlns:wpg="http://schemas.microsoft.com/office/word/2010/wordprocessingGroup" xmlns:wpi="http://schemas.microsoft.com/office/word/2010/wordprocessingInk" xmlns:wne="http://schemas.microsoft.com/office/word/2006/wordml" xmlns:wps="http://schemas.microsoft.com/office/word/2010/wordprocessingShape" mc:Ignorable="w14 w15 w16se w16cid w16 w16cex w16sdtdh w16sdtfl w16du wp14">
+  <w:p>
+    <w:pPr>
+      <w:pStyle w:val="Footer"/>
+    </w:pPr>
+  </w:p>
+</w:ftr>
+</file>
+
+<file path=word/footnotes.xml><?xml version="1.0" encoding="utf-8"?>
+<w:footnotes xmlns:wpc="http://schemas.microsoft.com/office/word/2010/wordprocessingCanvas" xmlns:cx="http://schemas.microsoft.com/office/drawing/2014/chartex" xmlns:cx1="http://schemas.microsoft.com/office/drawing/2015/9/8/chartex" xmlns:cx2="http://schemas.microsoft.com/office/drawing/2015/10/21/chartex" xmlns:cx3="http://schemas.microsoft.com/office/drawing/2016/5/9/chartex" xmlns:cx4="http://schemas.microsoft.com/office/drawing/2016/5/10/chartex" xmlns:cx5="http://schemas.microsoft.com/office/drawing/2016/5/11/chartex" xmlns:cx6="http://schemas.microsoft.com/office/drawing/2016/5/12/chartex" xmlns:cx7="http://schemas.microsoft.com/office/drawing/2016/5/13/chartex" xmlns:cx8="http://schemas.microsoft.com/office/drawing/2016/5/14/chartex" xmlns:mc="http://schemas.openxmlformats.org/markup-compatibility/2006" xmlns:aink="http://schemas.microsoft.com/office/drawing/2016/ink" xmlns:am3d="http://schemas.microsoft.com/office/drawing/2017/model3d" xmlns:o="urn:schemas-microsoft-com:office:office" xmlns:oel="http://schemas.microsoft.com/office/2019/extlst" xmlns:r="http://schemas.openxmlformats.org/officeDocument/2006/relationships" xmlns:m="http://schemas.openxmlformats.org/officeDocument/2006/math" xmlns:v="urn:schemas-microsoft-com:vml" xmlns:wp14="http://schemas.microsoft.com/office/word/2010/wordprocessingDrawing" xmlns:wp="http://schemas.openxmlformats.org/drawingml/2006/wordprocessingDrawing" xmlns:w10="urn:schemas-microsoft-com:office:word" xmlns:w="http://schemas.openxmlformats.org/wordprocessingml/2006/main" xmlns:w14="http://schemas.microsoft.com/office/word/2010/wordml" xmlns:w15="http://schemas.microsoft.com/office/word/2012/wordml" xmlns:w16cei="http://schemas.microsoft.com/office/word/2026/wordml/cei" xmlns:w16cex="http://schemas.microsoft.com/office/word/2018/wordml/cex" xmlns:w16cid="http://schemas.microsoft.com/office/word/2016/wordml/cid" xmlns:w16="http://schemas.microsoft.com/office/word/2018/wordml" xmlns:w16du="http://schemas.microsoft.com/office/word/2023/wordml/word16du" xmlns:w16sdtdh="http://schemas.microsoft.com/office/word/2020/wordml/sdtdatahash" xmlns:w16sdtfl="http://schemas.microsoft.com/office/word/2024/wordml/sdtformatlock" xmlns:w16se="http://schemas.microsoft.com/office/word/2015/wordml/symex" xmlns:wpg="http://schemas.microsoft.com/office/word/2010/wordprocessingGroup" xmlns:wpi="http://schemas.microsoft.com/office/word/2010/wordprocessingInk" xmlns:wne="http://schemas.microsoft.com/office/word/2006/wordml" xmlns:wps="http://schemas.microsoft.com/office/word/2010/wordprocessingShape" mc:Ignorable="w14 w15 w16se w16cid w16 w16cex w16sdtdh w16sdtfl w16du wp14">
+  <w:footnote w:type="separator" w:id="-1">
+    <w:p>
+      <w:pPr>
+        <w:spacing w:after="0" w:line="240" w:lineRule="auto"/>
+      </w:pPr>
+      <w:r>
+        <w:separator/>
+      </w:r>
+    </w:p>
+  </w:footnote>
+  <w:footnote w:type="continuationSeparator" w:id="0">
+    <w:p>
+      <w:pPr>
+        <w:spacing w:after="0" w:line="240" w:lineRule="auto"/>
+      </w:pPr>
+      <w:r>
+        <w:continuationSeparator/>
+      </w:r>
+    </w:p>
+  </w:footnote>
+</w:footnotes>
+</file>
+
+<file path=word/header1.xml><?xml version="1.0" encoding="utf-8"?>
+<w:hdr xmlns:wpc="http://schemas.microsoft.com/office/word/2010/wordprocessingCanvas" xmlns:cx="http://schemas.microsoft.com/office/drawing/2014/chartex" xmlns:cx1="http://schemas.microsoft.com/office/drawing/2015/9/8/chartex" xmlns:cx2="http://schemas.microsoft.com/office/drawing/2015/10/21/chartex" xmlns:cx3="http://schemas.microsoft.com/office/drawing/2016/5/9/chartex" xmlns:cx4="http://schemas.microsoft.com/office/drawing/2016/5/10/chartex" xmlns:cx5="http://schemas.microsoft.com/office/drawing/2016/5/11/chartex" xmlns:cx6="http://schemas.microsoft.com/office/drawing/2016/5/12/chartex" xmlns:cx7="http://schemas.microsoft.com/office/drawing/2016/5/13/chartex" xmlns:cx8="http://schemas.microsoft.com/office/drawing/2016/5/14/chartex" xmlns:mc="http://schemas.openxmlformats.org/markup-compatibility/2006" xmlns:aink="http://schemas.microsoft.com/office/drawing/2016/ink" xmlns:am3d="http://schemas.microsoft.com/office/drawing/2017/model3d" xmlns:o="urn:schemas-microsoft-com:office:office" xmlns:oel="http://schemas.microsoft.com/office/2019/extlst" xmlns:r="http://schemas.openxmlformats.org/officeDocument/2006/relationships" xmlns:m="http://schemas.openxmlformats.org/officeDocument/2006/math" xmlns:v="urn:schemas-microsoft-com:vml" xmlns:wp14="http://schemas.microsoft.com/office/word/2010/wordprocessingDrawing" xmlns:wp="http://schemas.openxmlformats.org/drawingml/2006/wordprocessingDrawing" xmlns:w10="urn:schemas-microsoft-com:office:word" xmlns:w="http://schemas.openxmlformats.org/wordprocessingml/2006/main" xmlns:w14="http://schemas.microsoft.com/office/word/2010/wordml" xmlns:w15="http://schemas.microsoft.com/office/word/2012/wordml" xmlns:w16cei="http://schemas.microsoft.com/office/word/2026/wordml/cei" xmlns:w16cex="http://schemas.microsoft.com/office/word/2018/wordml/cex" xmlns:w16cid="http://schemas.microsoft.com/office/word/2016/wordml/cid" xmlns:w16="http://schemas.microsoft.com/office/word/2018/wordml" xmlns:w16du="http://schemas.microsoft.com/office/word/2023/wordml/word16du" xmlns:w16sdtdh="http://schemas.microsoft.com/office/word/2020/wordml/sdtdatahash" xmlns:w16sdtfl="http://schemas.microsoft.com/office/word/2024/wordml/sdtformatlock" xmlns:w16se="http://schemas.microsoft.com/office/word/2015/wordml/symex" xmlns:wpg="http://schemas.microsoft.com/office/word/2010/wordprocessingGroup" xmlns:wpi="http://schemas.microsoft.com/office/word/2010/wordprocessingInk" xmlns:wne="http://schemas.microsoft.com/office/word/2006/wordml" xmlns:wps="http://schemas.microsoft.com/office/word/2010/wordprocessingShape" mc:Ignorable="w14 w15 w16se w16cid w16 w16cex w16sdtdh w16sdtfl w16du wp14">
+  <w:p>
+    <w:pPr>
+      <w:pStyle w:val="Header"/>
+    </w:pPr>
+    <w:r>
+      <w:rPr>
+        <w:noProof/>
+      </w:rPr>
+      <w:pict w14:anchorId="5796DC96">
+        <v:shapetype id="_x0000_t136" coordsize="21600,21600" o:spt="136" adj="10800" path="m@7,l@8,m@5,21600l@6,21600e">
+          <v:formulas>
+            <v:f eqn="sum #0 0 10800"/>
+            <v:f eqn="prod #0 2 1"/>
+            <v:f eqn="sum 21600 0 @1"/>
+            <v:f eqn="sum 0 0 @2"/>
+            <v:f eqn="sum 21600 0 @3"/>
+            <v:f eqn="if @0 @3 0"/>
+            <v:f eqn="if @0 21600 @1"/>
+            <v:f eqn="if @0 0 @2"/>
+            <v:f eqn="if @0 @4 21600"/>
+            <v:f eqn="mid @5 @6"/>
+            <v:f eqn="mid @8 @5"/>
+            <v:f eqn="mid @7 @8"/>
+            <v:f eqn="mid @6 @7"/>
+            <v:f eqn="sum @6 0 @5"/>
+          </v:formulas>
+          <v:path textpathok="t" o:connecttype="custom" o:connectlocs="@9,0;@10,10800;@11,21600;@12,10800" o:connectangles="270,180,90,0"/>
+          <v:textpath on="t" fitshape="t"/>
+          <v:handles>
+            <v:h position="#0,bottomRight" xrange="6629,14971"/>
+          </v:handles>
+          <o:lock v:ext="edit" text="t" shapetype="t"/>
+        </v:shapetype>
+        <v:shape id="PowerPlusWaterMarkObject2294219" o:spid="_x0000_s1026" type="#_x0000_t136" style="position:absolute;margin-left:0;margin-top:0;width:439.9pt;height:219.95pt;rotation:315;z-index:-251655168;mso-position-horizontal:center;mso-position-horizontal-relative:margin;mso-position-vertical:center;mso-position-vertical-relative:margin" o:allowincell="f" fillcolor="silver" stroked="f">
+          <v:fill opacity=".5"/>
+          <v:textpath style="font-family:&quot;Calibri&quot;;font-size:1pt" string="Muz.Ali"/>
+        </v:shape>
+      </w:pict>
+    </w:r>
+  </w:p>
+</w:hdr>
+</file>
+
+<file path=word/header2.xml><?xml version="1.0" encoding="utf-8"?>
+<w:hdr xmlns:wpc="http://schemas.microsoft.com/office/word/2010/wordprocessingCanvas" xmlns:cx="http://schemas.microsoft.com/office/drawing/2014/chartex" xmlns:cx1="http://schemas.microsoft.com/office/drawing/2015/9/8/chartex" xmlns:cx2="http://schemas.microsoft.com/office/drawing/2015/10/21/chartex" xmlns:cx3="http://schemas.microsoft.com/office/drawing/2016/5/9/chartex" xmlns:cx4="http://schemas.microsoft.com/office/drawing/2016/5/10/chartex" xmlns:cx5="http://schemas.microsoft.com/office/drawing/2016/5/11/chartex" xmlns:cx6="http://schemas.microsoft.com/office/drawing/2016/5/12/chartex" xmlns:cx7="http://schemas.microsoft.com/office/drawing/2016/5/13/chartex" xmlns:cx8="http://schemas.microsoft.com/office/drawing/2016/5/14/chartex" xmlns:mc="http://schemas.openxmlformats.org/markup-compatibility/2006" xmlns:aink="http://schemas.microsoft.com/office/drawing/2016/ink" xmlns:am3d="http://schemas.microsoft.com/office/drawing/2017/model3d" xmlns:o="urn:schemas-microsoft-com:office:office" xmlns:oel="http://schemas.microsoft.com/office/2019/extlst" xmlns:r="http://schemas.openxmlformats.org/officeDocument/2006/relationships" xmlns:m="http://schemas.openxmlformats.org/officeDocument/2006/math" xmlns:v="urn:schemas-microsoft-com:vml" xmlns:wp14="http://schemas.microsoft.com/office/word/2010/wordprocessingDrawing" xmlns:wp="http://schemas.openxmlformats.org/drawingml/2006/wordprocessingDrawing" xmlns:w10="urn:schemas-microsoft-com:office:word" xmlns:w="http://schemas.openxmlformats.org/wordprocessingml/2006/main" xmlns:w14="http://schemas.microsoft.com/office/word/2010/wordml" xmlns:w15="http://schemas.microsoft.com/office/word/2012/wordml" xmlns:w16cei="http://schemas.microsoft.com/office/word/2026/wordml/cei" xmlns:w16cex="http://schemas.microsoft.com/office/word/2018/wordml/cex" xmlns:w16cid="http://schemas.microsoft.com/office/word/2016/wordml/cid" xmlns:w16="http://schemas.microsoft.com/office/word/2018/wordml" xmlns:w16du="http://schemas.microsoft.com/office/word/2023/wordml/word16du" xmlns:w16sdtdh="http://schemas.microsoft.com/office/word/2020/wordml/sdtdatahash" xmlns:w16sdtfl="http://schemas.microsoft.com/office/word/2024/wordml/sdtformatlock" xmlns:w16se="http://schemas.microsoft.com/office/word/2015/wordml/symex" xmlns:wpg="http://schemas.microsoft.com/office/word/2010/wordprocessingGroup" xmlns:wpi="http://schemas.microsoft.com/office/word/2010/wordprocessingInk" xmlns:wne="http://schemas.microsoft.com/office/word/2006/wordml" xmlns:wps="http://schemas.microsoft.com/office/word/2010/wordprocessingShape" mc:Ignorable="w14 w15 w16se w16cid w16 w16cex w16sdtdh w16sdtfl w16du wp14">
+  <w:p>
+    <w:pPr>
+      <w:pStyle w:val="Header"/>
+      <w:jc w:val="center"/>
+    </w:pPr>
+    <w:r>
+      <w:rPr>
+        <w:noProof/>
+      </w:rPr>
+      <w:pict w14:anchorId="37E6DE95">
+        <v:shapetype id="_x0000_t136" coordsize="21600,21600" o:spt="136" adj="10800" path="m@7,l@8,m@5,21600l@6,21600e">
+          <v:formulas>
+            <v:f eqn="sum #0 0 10800"/>
+            <v:f eqn="prod #0 2 1"/>
+            <v:f eqn="sum 21600 0 @1"/>
+            <v:f eqn="sum 0 0 @2"/>
+            <v:f eqn="sum 21600 0 @3"/>
+            <v:f eqn="if @0 @3 0"/>
+            <v:f eqn="if @0 21600 @1"/>
+            <v:f eqn="if @0 0 @2"/>
+            <v:f eqn="if @0 @4 21600"/>
+            <v:f eqn="mid @5 @6"/>
+            <v:f eqn="mid @8 @5"/>
+            <v:f eqn="mid @7 @8"/>
+            <v:f eqn="mid @6 @7"/>
+            <v:f eqn="sum @6 0 @5"/>
+          </v:formulas>
+          <v:path textpathok="t" o:connecttype="custom" o:connectlocs="@9,0;@10,10800;@11,21600;@12,10800" o:connectangles="270,180,90,0"/>
+          <v:textpath on="t" fitshape="t"/>
+          <v:handles>
+            <v:h position="#0,bottomRight" xrange="6629,14971"/>
+          </v:handles>
+          <o:lock v:ext="edit" text="t" shapetype="t"/>
+        </v:shapetype>
+        <v:shape id="PowerPlusWaterMarkObject2294220" o:spid="_x0000_s1027" type="#_x0000_t136" style="position:absolute;left:0;text-align:left;margin-left:0;margin-top:0;width:439.9pt;height:219.95pt;rotation:315;z-index:-251653120;mso-position-horizontal:center;mso-position-horizontal-relative:margin;mso-position-vertical:center;mso-position-vertical-relative:margin" o:allowincell="f" fillcolor="silver" stroked="f">
+          <v:fill opacity=".5"/>
+          <v:textpath style="font-family:&quot;Calibri&quot;;font-size:1pt" string="Muz.Ali"/>
+        </v:shape>
+      </w:pict>
+    </w:r>
+    <w:sdt>
+      <w:sdtPr>
+        <w:id w:val="898638812"/>
+        <w:docPartObj>
+          <w:docPartGallery w:val="Page Numbers (Top of Page)"/>
+          <w:docPartUnique/>
+        </w:docPartObj>
+      </w:sdtPr>
+      <w:sdtEndPr>
+        <w:rPr>
+          <w:noProof/>
+        </w:rPr>
+      </w:sdtEndPr>
+      <w:sdtContent>
+        <w:r>
+          <w:fldChar w:fldCharType="begin"/>
+        </w:r>
+        <w:r>
+          <w:instrText xml:space="preserve"> PAGE   \* MERGEFORMAT </w:instrText>
+        </w:r>
+        <w:r>
+          <w:fldChar w:fldCharType="separate"/>
+        </w:r>
+        <w:r>
+          <w:rPr>
+            <w:noProof/>
+          </w:rPr>
+          <w:t>2</w:t>
+        </w:r>
+        <w:r>
+          <w:rPr>
+            <w:noProof/>
+          </w:rPr>
+          <w:fldChar w:fldCharType="end"/>
+        </w:r>
+      </w:sdtContent>
+    </w:sdt>
+  </w:p>
+  <w:p>
+    <w:pPr>
+      <w:pStyle w:val="Header"/>
+      <w:rPr>
+        <w:b/>
+        <w:bCs/>
+        <w:color w:val="EE0000"/>
+        <w:sz w:val="26"/>
+        <w:szCs w:val="26"/>
+      </w:rPr>
+    </w:pPr>
+    <w:r>
+      <w:rPr>
+        <w:b/>
+        <w:bCs/>
+        <w:color w:val="EE0000"/>
+        <w:sz w:val="26"/>
+        <w:szCs w:val="26"/>
+      </w:rPr>
+      <w:t>Muz.Ali</w:t>
+    </w:r>
+  </w:p>
+</w:hdr>
+</file>
+
+<file path=word/header3.xml><?xml version="1.0" encoding="utf-8"?>
+<w:hdr xmlns:wpc="http://schemas.microsoft.com/office/word/2010/wordprocessingCanvas" xmlns:cx="http://schemas.microsoft.com/office/drawing/2014/chartex" xmlns:cx1="http://schemas.microsoft.com/office/drawing/2015/9/8/chartex" xmlns:cx2="http://schemas.microsoft.com/office/drawing/2015/10/21/chartex" xmlns:cx3="http://schemas.microsoft.com/office/drawing/2016/5/9/chartex" xmlns:cx4="http://schemas.microsoft.com/office/drawing/2016/5/10/chartex" xmlns:cx5="http://schemas.microsoft.com/office/drawing/2016/5/11/chartex" xmlns:cx6="http://schemas.microsoft.com/office/drawing/2016/5/12/chartex" xmlns:cx7="http://schemas.microsoft.com/office/drawing/2016/5/13/chartex" xmlns:cx8="http://schemas.microsoft.com/office/drawing/2016/5/14/chartex" xmlns:mc="http://schemas.openxmlformats.org/markup-compatibility/2006" xmlns:aink="http://schemas.microsoft.com/office/drawing/2016/ink" xmlns:am3d="http://schemas.microsoft.com/office/drawing/2017/model3d" xmlns:o="urn:schemas-microsoft-com:office:office" xmlns:oel="http://schemas.microsoft.com/office/2019/extlst" xmlns:r="http://schemas.openxmlformats.org/officeDocument/2006/relationships" xmlns:m="http://schemas.openxmlformats.org/officeDocument/2006/math" xmlns:v="urn:schemas-microsoft-com:vml" xmlns:wp14="http://schemas.microsoft.com/office/word/2010/wordprocessingDrawing" xmlns:wp="http://schemas.openxmlformats.org/drawingml/2006/wordprocessingDrawing" xmlns:w10="urn:schemas-microsoft-com:office:word" xmlns:w="http://schemas.openxmlformats.org/wordprocessingml/2006/main" xmlns:w14="http://schemas.microsoft.com/office/word/2010/wordml" xmlns:w15="http://schemas.microsoft.com/office/word/2012/wordml" xmlns:w16cei="http://schemas.microsoft.com/office/word/2026/wordml/cei" xmlns:w16cex="http://schemas.microsoft.com/office/word/2018/wordml/cex" xmlns:w16cid="http://schemas.microsoft.com/office/word/2016/wordml/cid" xmlns:w16="http://schemas.microsoft.com/office/word/2018/wordml" xmlns:w16du="http://schemas.microsoft.com/office/word/2023/wordml/word16du" xmlns:w16sdtdh="http://schemas.microsoft.com/office/word/2020/wordml/sdtdatahash" xmlns:w16sdtfl="http://schemas.microsoft.com/office/word/2024/wordml/sdtformatlock" xmlns:w16se="http://schemas.microsoft.com/office/word/2015/wordml/symex" xmlns:wpg="http://schemas.microsoft.com/office/word/2010/wordprocessingGroup" xmlns:wpi="http://schemas.microsoft.com/office/word/2010/wordprocessingInk" xmlns:wne="http://schemas.microsoft.com/office/word/2006/wordml" xmlns:wps="http://schemas.microsoft.com/office/word/2010/wordprocessingShape" mc:Ignorable="w14 w15 w16se w16cid w16 w16cex w16sdtdh w16sdtfl w16du wp14">
+  <w:p>
+    <w:pPr>
+      <w:pStyle w:val="Header"/>
+    </w:pPr>
+    <w:r>
+      <w:rPr>
+        <w:noProof/>
+      </w:rPr>
+      <w:pict w14:anchorId="4180105E">
+        <v:shapetype id="_x0000_t136" coordsize="21600,21600" o:spt="136" adj="10800" path="m@7,l@8,m@5,21600l@6,21600e">
+          <v:formulas>
+            <v:f eqn="sum #0 0 10800"/>
+            <v:f eqn="prod #0 2 1"/>
+            <v:f eqn="sum 21600 0 @1"/>
+            <v:f eqn="sum 0 0 @2"/>
+            <v:f eqn="sum 21600 0 @3"/>
+            <v:f eqn="if @0 @3 0"/>
+            <v:f eqn="if @0 21600 @1"/>
+            <v:f eqn="if @0 0 @2"/>
+            <v:f eqn="if @0 @4 21600"/>
+            <v:f eqn="mid @5 @6"/>
+            <v:f eqn="mid @8 @5"/>
+            <v:f eqn="mid @7 @8"/>
+            <v:f eqn="mid @6 @7"/>
+            <v:f eqn="sum @6 0 @5"/>
+          </v:formulas>
+          <v:path textpathok="t" o:connecttype="custom" o:connectlocs="@9,0;@10,10800;@11,21600;@12,10800" o:connectangles="270,180,90,0"/>
+          <v:textpath on="t" fitshape="t"/>
+          <v:handles>
+            <v:h position="#0,bottomRight" xrange="6629,14971"/>
+          </v:handles>
+          <o:lock v:ext="edit" text="t" shapetype="t"/>
+        </v:shapetype>
+        <v:shape id="PowerPlusWaterMarkObject2294218" o:spid="_x0000_s1025" type="#_x0000_t136" style="position:absolute;margin-left:0;margin-top:0;width:439.9pt;height:219.95pt;rotation:315;z-index:-251657216;mso-position-horizontal:center;mso-position-horizontal-relative:margin;mso-position-vertical:center;mso-position-vertical-relative:margin" o:allowincell="f" fillcolor="silver" stroked="f">
+          <v:fill opacity=".5"/>
+          <v:textpath style="font-family:&quot;Calibri&quot;;font-size:1pt" string="Muz.Ali"/>
+        </v:shape>
+      </w:pict>
+    </w:r>
+  </w:p>
+</w:hdr>
 </file>
 
 <file path=word/numbering.xml><?xml version="1.0" encoding="utf-8"?>
@@ -8479,6 +8038,50 @@
       </w:tblBorders>
     </w:tblPr>
   </w:style>
+  <w:style w:type="paragraph" w:styleId="Header">
+    <w:name w:val="header"/>
+    <w:basedOn w:val="Normal"/>
+    <w:link w:val="HeaderChar"/>
+    <w:uiPriority w:val="99"/>
+    <w:unhideWhenUsed/>
+    <w:rsid w:val="00F07C3C"/>
+    <w:pPr>
+      <w:tabs>
+        <w:tab w:val="center" w:pos="4680"/>
+        <w:tab w:val="right" w:pos="9360"/>
+      </w:tabs>
+      <w:spacing w:after="0" w:line="240" w:lineRule="auto"/>
+    </w:pPr>
+  </w:style>
+  <w:style w:type="character" w:customStyle="1" w:styleId="HeaderChar">
+    <w:name w:val="Header Char"/>
+    <w:basedOn w:val="DefaultParagraphFont"/>
+    <w:link w:val="Header"/>
+    <w:uiPriority w:val="99"/>
+    <w:rsid w:val="00F07C3C"/>
+  </w:style>
+  <w:style w:type="paragraph" w:styleId="Footer">
+    <w:name w:val="footer"/>
+    <w:basedOn w:val="Normal"/>
+    <w:link w:val="FooterChar"/>
+    <w:uiPriority w:val="99"/>
+    <w:unhideWhenUsed/>
+    <w:rsid w:val="00F07C3C"/>
+    <w:pPr>
+      <w:tabs>
+        <w:tab w:val="center" w:pos="4680"/>
+        <w:tab w:val="right" w:pos="9360"/>
+      </w:tabs>
+      <w:spacing w:after="0" w:line="240" w:lineRule="auto"/>
+    </w:pPr>
+  </w:style>
+  <w:style w:type="character" w:customStyle="1" w:styleId="FooterChar">
+    <w:name w:val="Footer Char"/>
+    <w:basedOn w:val="DefaultParagraphFont"/>
+    <w:link w:val="Footer"/>
+    <w:uiPriority w:val="99"/>
+    <w:rsid w:val="00F07C3C"/>
+  </w:style>
 </w:styles>
 </file>
 
@@ -8775,4 +8378,16 @@
     </a:ext>
   </a:extLst>
 </a:theme>
+</file>
+
+<file path=customXml/item1.xml><?xml version="1.0" encoding="utf-8"?>
+<b:Sources xmlns:b="http://schemas.openxmlformats.org/officeDocument/2006/bibliography" xmlns="http://schemas.openxmlformats.org/officeDocument/2006/bibliography" SelectedStyle="\APASixthEditionOfficeOnline.xsl" StyleName="APA" Version="6"/>
+</file>
+
+<file path=customXml/itemProps1.xml><?xml version="1.0" encoding="utf-8"?>
+<ds:datastoreItem xmlns:ds="http://schemas.openxmlformats.org/officeDocument/2006/customXml" ds:itemID="{091A6F27-9025-452E-8E23-9B1DD67B7EB0}">
+  <ds:schemaRefs>
+    <ds:schemaRef ds:uri="http://schemas.openxmlformats.org/officeDocument/2006/bibliography"/>
+  </ds:schemaRefs>
+</ds:datastoreItem>
 </file>
</xml_diff>